<commit_message>
Add reviewer-facing subsidy package notes
</commit_message>
<xml_diff>
--- a/references/erdos319-progress-report.docx
+++ b/references/erdos319-progress-report.docx
@@ -72,7 +72,7 @@
         <w:spacing w:after="100"/>
       </w:pPr>
       <w:r>
-        <w:t>5. A small but clean singleton-side theorem: the Croot/Adenwalla constant is asymptotically optimal when one sign class has exactly one element.</w:t>
+        <w:t>5. A singleton-side theorem candidate / subclass result, subject to proof audit: the Croot/Adenwalla constant is expected to be asymptotically optimal when one sign class has exactly one element.</w:t>
       </w:r>
     </w:p>
     <w:p>
@@ -410,7 +410,7 @@
         <w:pStyle w:val="Heading1"/>
       </w:pPr>
       <w:r>
-        <w:t>5. Proof-level output B: singleton-side optimality</w:t>
+        <w:t>5. Proof-level output B: singleton-side optimality candidate</w:t>
       </w:r>
     </w:p>
     <w:p>
@@ -539,7 +539,7 @@
         <w:spacing w:after="100"/>
       </w:pPr>
       <w:r>
-        <w:t>This is not a full solution of #319, because in the full problem both sign classes may be large. But it is a genuine and clean subclass theorem.</w:t>
+        <w:t>This is not a full solution of #319, because in the full problem both sign classes may be large. It should be treated as a theorem candidate / subclass result until the proof is audited and written independently.</w:t>
       </w:r>
     </w:p>
     <w:p>
@@ -1224,7 +1224,7 @@
           </w:tcPr>
           <w:p>
             <w:r>
-              <w:t>Clean theorem; likely first writeable result.</w:t>
+              <w:t>Candidate subclass result; proof audit needed.</w:t>
             </w:r>
           </w:p>
         </w:tc>
@@ -1340,7 +1340,7 @@
         <w:spacing w:after="100"/>
       </w:pPr>
       <w:r>
-        <w:t>We obtained a clean subclass theorem: the known constant 1 - 1/e is asymptotically optimal among singleton-side signed circuits. We also identified a large-prime-factor obstruction and a fixed-Q dynamic-gate strategy that reduces several cases to explicit target-reachability inputs from Croot/Bloom/Liu-Sawhney-type unit-fraction machinery.</w:t>
+        <w:t>We isolated a singleton-side subclass result candidate: the known constant 1 - 1/e should be asymptotically optimal among singleton-side signed circuits, subject to a proof audit. We also identified a large-prime-factor obstruction and a fixed-Q dynamic-gate strategy that reduces several cases to explicit target-reachability inputs from Croot/Bloom/Liu-Sawhney-type unit-fraction machinery.</w:t>
       </w:r>
     </w:p>
     <w:p>

</xml_diff>